<commit_message>
Deploying to gh-pages from @ eea/CLMS_documents@b68c29ba226ee4d2fd4902321190564f508e5626 🚀
</commit_message>
<xml_diff>
--- a/develop/guidelines/it-principles_IT_Architecture_Principles_and_Implementation_Guidelines_v1.docx
+++ b/develop/guidelines/it-principles_IT_Architecture_Principles_and_Implementation_Guidelines_v1.docx
@@ -145,12 +145,6 @@
       <w:pPr>
         <w:pStyle w:val="FirstParagraph"/>
       </w:pPr>
-      <w:r>
-        <w:t xml:space="preserve">NEW DATA ADDEED FOR TESTING 123</w:t>
-      </w:r>
-      <w:r>
-        <w:t xml:space="preserve"> </w:t>
-      </w:r>
       <w:r>
         <w:t xml:space="preserve">The IT architecture principles set the overall framework for the EEA CLMS IT landscape. The principles are designed to ensure a consistency in deliverables and at the same time support the CLMS program’s IT vision and -strategy. The principles are designed to ensure that IT solutions are coherent, can be further developed and operated efficiently, that they support business needs and security requirements, etc.</w:t>
       </w:r>

</xml_diff>